<commit_message>
Remove em/en dashes and emojis across the project
Replace em/en dashes with hyphens and strip emoji characters from all text
sources: backend (app.py, rag_setup.py, lawsteps_pipeline.py, scripts, tests),
frontend (index.html, app.js, style.css), curated data JSON, the 6,845-chunk
official-law corpus, and all docs. Preserves arrows (<->, ->), box-drawing, and
non-Latin scripts (Devanagari etc.). Regenerated the docx clean; cache-bust
app.js v8->v9, style.css v7->v8. All JSON parses, Python compiles, JS valid.

Co-Authored-By: Claude Opus 4.8 <noreply@anthropic.com>
</commit_message>
<xml_diff>
--- a/docs/AdhiKaar_Documentation.docx
+++ b/docs/AdhiKaar_Documentation.docx
@@ -76,7 +76,7 @@
         <w:spacing w:after="120"/>
       </w:pPr>
       <w:r>
-        <w:t>अधिKaar ("Adhikaar", meaning "rights") is a legal-navigation assistant that helps ordinary Indian citizens understand their legal rights, decode legal documents, and take concrete next steps — in 11 Indian languages, by voice or text, and entirely on their own device. Unlike cloud chatbots, every component runs locally: the language model, the legal knowledge base, speech recognition, speech synthesis and document OCR. Nothing a user types, says, or uploads ever leaves their computer.</w:t>
+        <w:t>अधिKaar ("Adhikaar", meaning "rights") is a legal-navigation assistant that helps ordinary Indian citizens understand their legal rights, decode legal documents, and take concrete next steps - in 11 Indian languages, by voice or text, and entirely on their own device. Unlike cloud chatbots, every component runs locally: the language model, the legal knowledge base, speech recognition, speech synthesis and document OCR. Nothing a user types, says, or uploads ever leaves their computer.</w:t>
       </w:r>
     </w:p>
     <w:p>
@@ -116,7 +116,7 @@
         <w:spacing w:after="120"/>
       </w:pPr>
       <w:r>
-        <w:t>Over a billion Indians face everyday legal situations — unpaid wages, withheld security deposits, FIRs, domestic violence, consumer disputes — yet meaningful legal help remains out of reach. Lawyers are unaffordable for most; official information is English-first, scattered, and written in dense legalese; and the recent overhaul of India's criminal laws (IPC replaced by the Bharatiya Nyaya Sanhita, CrPC by the Bharatiya Nagarik Suraksha Sanhita, both effective 1 July 2024) has made even existing guidance outdated.</w:t>
+        <w:t>Over a billion Indians face everyday legal situations - unpaid wages, withheld security deposits, FIRs, domestic violence, consumer disputes - yet meaningful legal help remains out of reach. Lawyers are unaffordable for most; official information is English-first, scattered, and written in dense legalese; and the recent overhaul of India's criminal laws (IPC replaced by the Bharatiya Nyaya Sanhita, CrPC by the Bharatiya Nagarik Suraksha Sanhita, both effective 1 July 2024) has made even existing guidance outdated.</w:t>
       </w:r>
     </w:p>
     <w:p>
@@ -180,7 +180,7 @@
         <w:spacing w:after="120"/>
       </w:pPr>
       <w:r>
-        <w:t>Not knowing your rights often means losing them — a missed limitation deadline, an unfiled complaint, an unchallenged illegal eviction. And because legal matters are deeply personal, cloud-based AI raises real privacy fears. अधिKaar addresses both: it democratises legal knowledge and keeps it private by design.</w:t>
+        <w:t>Not knowing your rights often means losing them - a missed limitation deadline, an unfiled complaint, an unchallenged illegal eviction. And because legal matters are deeply personal, cloud-based AI raises real privacy fears. अधिKaar addresses both: it democratises legal knowledge and keeps it private by design.</w:t>
       </w:r>
     </w:p>
     <w:p>
@@ -457,7 +457,7 @@
         <w:spacing w:after="120"/>
       </w:pPr>
       <w:r>
-        <w:t>The application follows a thin-client / local-service architecture. A zero-build vanilla-JavaScript single-page app runs in the browser; a Flask service on 127.0.0.1:5000 serves it and exposes a REST API. All heavy computation — LLM inference, embedding, retrieval, OCR, speech — happens inside the local service or, for OCR/voice-in-browser, on the client itself. No external API is called at runtime.</w:t>
+        <w:t>The application follows a thin-client / local-service architecture. A zero-build vanilla-JavaScript single-page app runs in the browser; a Flask service on 127.0.0.1:5000 serves it and exposes a REST API. All heavy computation - LLM inference, embedding, retrieval, OCR, speech - happens inside the local service or, for OCR/voice-in-browser, on the client itself. No external API is called at runtime.</w:t>
       </w:r>
     </w:p>
     <w:p>
@@ -1036,7 +1036,7 @@
         <w:spacing w:after="120"/>
       </w:pPr>
       <w:r>
-        <w:t>Gemma turns messy, real-world input — plain-language questions, code-mixed Hinglish, even garbled OCR of a scanned FIR — into grounded, citizen-readable legal guidance. Critically, its small on-device footprint is exactly what makes the offline, private-by-design promise achievable: a capable model that fits on a citizen's own machine, so sensitive legal details never travel to a server.</w:t>
+        <w:t>Gemma turns messy, real-world input - plain-language questions, code-mixed Hinglish, even garbled OCR of a scanned FIR - into grounded, citizen-readable legal guidance. Critically, its small on-device footprint is exactly what makes the offline, private-by-design promise achievable: a capable model that fits on a citizen's own machine, so sensitive legal details never travel to a server.</w:t>
       </w:r>
     </w:p>
     <w:p>
@@ -1204,7 +1204,7 @@
         <w:pStyle w:val="ListNumber"/>
       </w:pPr>
       <w:r>
-        <w:t>DRAFT — the model reads the retrieved statute excerpts and produces the six panels plus a list of claims, each citing the chunk IDs it relied on.</w:t>
+        <w:t>DRAFT - the model reads the retrieved statute excerpts and produces the six panels plus a list of claims, each citing the chunk IDs it relied on.</w:t>
       </w:r>
     </w:p>
     <w:p>
@@ -1212,7 +1212,7 @@
         <w:pStyle w:val="ListNumber"/>
       </w:pPr>
       <w:r>
-        <w:t>DETERMINISTIC GUARD — a regex hallucination check rejects any claim that names a section number absent from its cited excerpts, before any further model call.</w:t>
+        <w:t>DETERMINISTIC GUARD - a regex hallucination check rejects any claim that names a section number absent from its cited excerpts, before any further model call.</w:t>
       </w:r>
     </w:p>
     <w:p>
@@ -1220,7 +1220,7 @@
         <w:pStyle w:val="ListNumber"/>
       </w:pPr>
       <w:r>
-        <w:t>VERIFY — surviving claims are batch-checked against only their cited excerpts; unsupported claims are flagged.</w:t>
+        <w:t>VERIFY - surviving claims are batch-checked against only their cited excerpts; unsupported claims are flagged.</w:t>
       </w:r>
     </w:p>
     <w:p>
@@ -1228,7 +1228,7 @@
         <w:pStyle w:val="ListNumber"/>
       </w:pPr>
       <w:r>
-        <w:t>REPAIR — unsupported or unverified claims are excluded from the law, rights and sources panels; the "Sources" panel lists only the official URLs of chunks cited by verified claims.</w:t>
+        <w:t>REPAIR - unsupported or unverified claims are excluded from the law, rights and sources panels; the "Sources" panel lists only the official URLs of chunks cited by verified claims.</w:t>
       </w:r>
     </w:p>
     <w:p>
@@ -1236,7 +1236,7 @@
         <w:spacing w:after="120"/>
       </w:pPr>
       <w:r>
-        <w:t>The result: every citation shown to the user is either backed by retrieved official law or explicitly marked unverified — directly attacking AI hallucination in a domain where a wrong citation is dangerous.</w:t>
+        <w:t>The result: every citation shown to the user is either backed by retrieved official law or explicitly marked unverified - directly attacking AI hallucination in a domain where a wrong citation is dangerous.</w:t>
       </w:r>
     </w:p>
     <w:p>
@@ -1312,7 +1312,7 @@
         <w:spacing w:after="120"/>
       </w:pPr>
       <w:r>
-        <w:t>Uploaded documents are read on-device. For scanned, often bilingual Indian legal papers, the OCR model is chosen by the document's script rather than the UI language — defaulting to the Devanagari recogniser, which reads Devanagari and Latin together, so English structured fields (FIR number, sections, names, vehicle numbers) extract cleanly. A pdf.js text-layer path and Tesseract.js provide in-browser fallbacks.</w:t>
+        <w:t>Uploaded documents are read on-device. For scanned, often bilingual Indian legal papers, the OCR model is chosen by the document's script rather than the UI language - defaulting to the Devanagari recogniser, which reads Devanagari and Latin together, so English structured fields (FIR number, sections, names, vehicle numbers) extract cleanly. A pdf.js text-layer path and Tesseract.js provide in-browser fallbacks.</w:t>
       </w:r>
     </w:p>
     <w:p>
@@ -1340,7 +1340,7 @@
         <w:pStyle w:val="ListBullet"/>
       </w:pPr>
       <w:r>
-        <w:t>Loopback-only API (127.0.0.1) — the service is not exposed to the network by default.</w:t>
+        <w:t>Loopback-only API (127.0.0.1) - the service is not exposed to the network by default.</w:t>
       </w:r>
     </w:p>
     <w:p>
@@ -1384,7 +1384,7 @@
         <w:pStyle w:val="ListBullet"/>
       </w:pPr>
       <w:r>
-        <w:t>Genuinely offline and private — no cloud dependency, so sensitive legal details never leave the device.</w:t>
+        <w:t>Genuinely offline and private - no cloud dependency, so sensitive legal details never leave the device.</w:t>
       </w:r>
     </w:p>
     <w:p>
@@ -1392,7 +1392,7 @@
         <w:pStyle w:val="ListBullet"/>
       </w:pPr>
       <w:r>
-        <w:t>Claim-level verification — each statement checked against retrieved official law, unsupported claims dropped, real source links shown.</w:t>
+        <w:t>Claim-level verification - each statement checked against retrieved official law, unsupported claims dropped, real source links shown.</w:t>
       </w:r>
     </w:p>
     <w:p>
@@ -1400,7 +1400,7 @@
         <w:pStyle w:val="ListBullet"/>
       </w:pPr>
       <w:r>
-        <w:t>Current with the 2023–2024 legal transition — built-in IPC↔BNS and CrPC↔BNSS converters and a BNS/BNSS-first knowledge base.</w:t>
+        <w:t>Current with the 2023-2024 legal transition - built-in IPC↔BNS and CrPC↔BNSS converters and a BNS/BNSS-first knowledge base.</w:t>
       </w:r>
     </w:p>
     <w:p>
@@ -1408,7 +1408,7 @@
         <w:pStyle w:val="ListBullet"/>
       </w:pPr>
       <w:r>
-        <w:t>Truly multilingual and multimodal — 11 languages, voice in and voice out, and on-device document OCR with plain-language explanation.</w:t>
+        <w:t>Truly multilingual and multimodal - 11 languages, voice in and voice out, and on-device document OCR with plain-language explanation.</w:t>
       </w:r>
     </w:p>
     <w:p>
@@ -1416,7 +1416,7 @@
         <w:pStyle w:val="ListBullet"/>
       </w:pPr>
       <w:r>
-        <w:t>Action-oriented — not just answers, but ready-to-file documents, evidence checklists, and PAN-India legal-aid contacts.</w:t>
+        <w:t>Action-oriented - not just answers, but ready-to-file documents, evidence checklists, and PAN-India legal-aid contacts.</w:t>
       </w:r>
     </w:p>
     <w:p>
@@ -1484,7 +1484,7 @@
         <w:pStyle w:val="ListNumber"/>
       </w:pPr>
       <w:r>
-        <w:t>Start the service: python app.py — the app is served at http://localhost:5000.</w:t>
+        <w:t>Start the service: python app.py - the app is served at http://localhost:5000.</w:t>
       </w:r>
     </w:p>
     <w:p>
@@ -1512,7 +1512,7 @@
         <w:spacing w:after="120"/>
       </w:pPr>
       <w:r>
-        <w:t>Because the design is local-first, distribution means shipping the package so each user runs it on their own machine — via a one-command installer or Docker Compose (app + Ollama). For live demos, a free Cloudflare Tunnel exposes an HTTPS URL while all inference stays on the host machine.</w:t>
+        <w:t>Because the design is local-first, distribution means shipping the package so each user runs it on their own machine - via a one-command installer or Docker Compose (app + Ollama). For live demos, a free Cloudflare Tunnel exposes an HTTPS URL while all inference stays on the host machine.</w:t>
       </w:r>
     </w:p>
     <w:p>

</xml_diff>